<commit_message>
Day #372 - Datacamp + Journey Mapping 101
</commit_message>
<xml_diff>
--- a/src/coursera/meta_front_end_developer/course_principles_of_ux_ui_design/final_assessment/BOOKING_A_TABLE_ON_LITTLE_LEMON_WEBSITE_NOTES.docx
+++ b/src/coursera/meta_front_end_developer/course_principles_of_ux_ui_design/final_assessment/BOOKING_A_TABLE_ON_LITTLE_LEMON_WEBSITE_NOTES.docx
@@ -31,7 +31,23 @@
         <w:t>Little Lemon</w:t>
       </w:r>
       <w:r>
-        <w:t xml:space="preserve"> currently provides the user the capability to order food online.</w:t>
+        <w:t xml:space="preserve"> currently provides the </w:t>
+      </w:r>
+      <w:proofErr w:type="gramStart"/>
+      <w:r>
+        <w:t>user</w:t>
+      </w:r>
+      <w:proofErr w:type="gramEnd"/>
+      <w:r>
+        <w:t xml:space="preserve"> the </w:t>
+      </w:r>
+      <w:proofErr w:type="gramStart"/>
+      <w:r>
+        <w:t>capability</w:t>
+      </w:r>
+      <w:proofErr w:type="gramEnd"/>
+      <w:r>
+        <w:t xml:space="preserve"> to order food online.</w:t>
       </w:r>
     </w:p>
     <w:p>
@@ -94,7 +110,23 @@
           <w:i/>
           <w:iCs/>
         </w:rPr>
-        <w:t>reserve-a-table</w:t>
+        <w:t>reserve-</w:t>
+      </w:r>
+      <w:proofErr w:type="gramStart"/>
+      <w:r>
+        <w:rPr>
+          <w:i/>
+          <w:iCs/>
+        </w:rPr>
+        <w:t>a-</w:t>
+      </w:r>
+      <w:proofErr w:type="gramEnd"/>
+      <w:r>
+        <w:rPr>
+          <w:i/>
+          <w:iCs/>
+        </w:rPr>
+        <w:t>table</w:t>
       </w:r>
       <w:r>
         <w:t xml:space="preserve"> feature. The new feature should allow an online user the capability to:</w:t>
@@ -154,10 +186,18 @@
         </w:numPr>
       </w:pPr>
       <w:r>
-        <w:t xml:space="preserve">Cancel a table reservation </w:t>
-      </w:r>
-      <w:r>
-        <w:t xml:space="preserve"> (using e-mail address)</w:t>
+        <w:t xml:space="preserve">Cancel a table </w:t>
+      </w:r>
+      <w:proofErr w:type="gramStart"/>
+      <w:r>
+        <w:t xml:space="preserve">reservation </w:t>
+      </w:r>
+      <w:r>
+        <w:t xml:space="preserve"> (</w:t>
+      </w:r>
+      <w:proofErr w:type="gramEnd"/>
+      <w:r>
+        <w:t>using e-mail address)</w:t>
       </w:r>
     </w:p>
     <w:p>
@@ -230,7 +270,38 @@
         <w:t>This will be a future-state journey map to present how customers will reserve a table.</w:t>
       </w:r>
       <w:r>
-        <w:t xml:space="preserve"> The journey map should present the following scenarios, keeping in mind that it will be for our persona, Maya Chen.  </w:t>
+        <w:t xml:space="preserve"> The journey map should present the following scenarios, keeping in mind that it will be for our </w:t>
+      </w:r>
+      <w:proofErr w:type="gramStart"/>
+      <w:r>
+        <w:t>persona</w:t>
+      </w:r>
+      <w:proofErr w:type="gramEnd"/>
+      <w:r>
+        <w:t xml:space="preserve">, Maya Chen.  </w:t>
+      </w:r>
+    </w:p>
+    <w:p>
+      <w:r>
+        <w:t xml:space="preserve">A </w:t>
+      </w:r>
+      <w:r>
+        <w:rPr>
+          <w:b/>
+          <w:bCs/>
+        </w:rPr>
+        <w:t>journey map</w:t>
+      </w:r>
+      <w:r>
+        <w:t xml:space="preserve"> is a visualization of the process that a person goes through </w:t>
+      </w:r>
+      <w:proofErr w:type="gramStart"/>
+      <w:r>
+        <w:t>in order to</w:t>
+      </w:r>
+      <w:proofErr w:type="gramEnd"/>
+      <w:r>
+        <w:t xml:space="preserve"> accomplish a goal. </w:t>
       </w:r>
     </w:p>
     <w:p>
@@ -243,9 +314,60 @@
     </w:p>
     <w:p>
       <w:r>
-        <w:t>TBD.</w:t>
-      </w:r>
-    </w:p>
+        <w:t xml:space="preserve">The primary goal we will implement is a user creating/setting up a table reservation for 4 next Friday during lunch time. </w:t>
+      </w:r>
+    </w:p>
+    <w:p>
+      <w:r>
+        <w:t xml:space="preserve">We will also explore the process </w:t>
+      </w:r>
+      <w:proofErr w:type="gramStart"/>
+      <w:r>
+        <w:t>to</w:t>
+      </w:r>
+      <w:proofErr w:type="gramEnd"/>
+      <w:r>
+        <w:t>:</w:t>
+      </w:r>
+    </w:p>
+    <w:p>
+      <w:pPr>
+        <w:pStyle w:val="ListParagraph"/>
+        <w:numPr>
+          <w:ilvl w:val="0"/>
+          <w:numId w:val="6"/>
+        </w:numPr>
+      </w:pPr>
+      <w:r>
+        <w:t>Cancel the table reservation</w:t>
+      </w:r>
+    </w:p>
+    <w:p>
+      <w:pPr>
+        <w:pStyle w:val="ListParagraph"/>
+        <w:numPr>
+          <w:ilvl w:val="0"/>
+          <w:numId w:val="6"/>
+        </w:numPr>
+      </w:pPr>
+      <w:r>
+        <w:lastRenderedPageBreak/>
+        <w:t>Modify the table reservation</w:t>
+      </w:r>
+    </w:p>
+    <w:p>
+      <w:pPr>
+        <w:pStyle w:val="ListParagraph"/>
+        <w:numPr>
+          <w:ilvl w:val="0"/>
+          <w:numId w:val="6"/>
+        </w:numPr>
+      </w:pPr>
+      <w:r>
+        <w:t>Check the status of the table reservation</w:t>
+      </w:r>
+    </w:p>
+    <w:p/>
     <w:p>
       <w:pPr>
         <w:pStyle w:val="Heading2"/>
@@ -283,8 +405,15 @@
         </w:numPr>
       </w:pPr>
       <w:r>
-        <w:lastRenderedPageBreak/>
-        <w:t>E-mail address (used as the key of the reservation.)</w:t>
+        <w:t xml:space="preserve">E-mail address (used as the key </w:t>
+      </w:r>
+      <w:proofErr w:type="gramStart"/>
+      <w:r>
+        <w:t>of</w:t>
+      </w:r>
+      <w:proofErr w:type="gramEnd"/>
+      <w:r>
+        <w:t xml:space="preserve"> the reservation.)</w:t>
       </w:r>
     </w:p>
     <w:p>
@@ -323,6 +452,12 @@
         <w:t>Total number of guests</w:t>
       </w:r>
     </w:p>
+    <w:p>
+      <w:r>
+        <w:t xml:space="preserve">For creation and modification of table reservations we expect the reservation to be in “Pending mail confirmation” state before the reservation is moved to “approve” state. </w:t>
+      </w:r>
+    </w:p>
+    <w:p/>
     <w:p>
       <w:r>
         <w:t>Other possible journey maps:</w:t>
@@ -691,6 +826,95 @@
     </w:lvl>
   </w:abstractNum>
   <w:abstractNum w:abstractNumId="1" w15:restartNumberingAfterBreak="0">
+    <w:nsid w:val="18261DC0"/>
+    <w:multiLevelType w:val="hybridMultilevel"/>
+    <w:tmpl w:val="979E09E2"/>
+    <w:lvl w:ilvl="0" w:tplc="0409000F">
+      <w:start w:val="1"/>
+      <w:numFmt w:val="decimal"/>
+      <w:lvlText w:val="%1."/>
+      <w:lvlJc w:val="left"/>
+      <w:pPr>
+        <w:ind w:left="720" w:hanging="360"/>
+      </w:pPr>
+      <w:rPr>
+        <w:rFonts w:hint="default"/>
+      </w:rPr>
+    </w:lvl>
+    <w:lvl w:ilvl="1" w:tplc="04090019" w:tentative="1">
+      <w:start w:val="1"/>
+      <w:numFmt w:val="lowerLetter"/>
+      <w:lvlText w:val="%2."/>
+      <w:lvlJc w:val="left"/>
+      <w:pPr>
+        <w:ind w:left="1440" w:hanging="360"/>
+      </w:pPr>
+    </w:lvl>
+    <w:lvl w:ilvl="2" w:tplc="0409001B" w:tentative="1">
+      <w:start w:val="1"/>
+      <w:numFmt w:val="lowerRoman"/>
+      <w:lvlText w:val="%3."/>
+      <w:lvlJc w:val="right"/>
+      <w:pPr>
+        <w:ind w:left="2160" w:hanging="180"/>
+      </w:pPr>
+    </w:lvl>
+    <w:lvl w:ilvl="3" w:tplc="0409000F" w:tentative="1">
+      <w:start w:val="1"/>
+      <w:numFmt w:val="decimal"/>
+      <w:lvlText w:val="%4."/>
+      <w:lvlJc w:val="left"/>
+      <w:pPr>
+        <w:ind w:left="2880" w:hanging="360"/>
+      </w:pPr>
+    </w:lvl>
+    <w:lvl w:ilvl="4" w:tplc="04090019" w:tentative="1">
+      <w:start w:val="1"/>
+      <w:numFmt w:val="lowerLetter"/>
+      <w:lvlText w:val="%5."/>
+      <w:lvlJc w:val="left"/>
+      <w:pPr>
+        <w:ind w:left="3600" w:hanging="360"/>
+      </w:pPr>
+    </w:lvl>
+    <w:lvl w:ilvl="5" w:tplc="0409001B" w:tentative="1">
+      <w:start w:val="1"/>
+      <w:numFmt w:val="lowerRoman"/>
+      <w:lvlText w:val="%6."/>
+      <w:lvlJc w:val="right"/>
+      <w:pPr>
+        <w:ind w:left="4320" w:hanging="180"/>
+      </w:pPr>
+    </w:lvl>
+    <w:lvl w:ilvl="6" w:tplc="0409000F" w:tentative="1">
+      <w:start w:val="1"/>
+      <w:numFmt w:val="decimal"/>
+      <w:lvlText w:val="%7."/>
+      <w:lvlJc w:val="left"/>
+      <w:pPr>
+        <w:ind w:left="5040" w:hanging="360"/>
+      </w:pPr>
+    </w:lvl>
+    <w:lvl w:ilvl="7" w:tplc="04090019" w:tentative="1">
+      <w:start w:val="1"/>
+      <w:numFmt w:val="lowerLetter"/>
+      <w:lvlText w:val="%8."/>
+      <w:lvlJc w:val="left"/>
+      <w:pPr>
+        <w:ind w:left="5760" w:hanging="360"/>
+      </w:pPr>
+    </w:lvl>
+    <w:lvl w:ilvl="8" w:tplc="0409001B" w:tentative="1">
+      <w:start w:val="1"/>
+      <w:numFmt w:val="lowerRoman"/>
+      <w:lvlText w:val="%9."/>
+      <w:lvlJc w:val="right"/>
+      <w:pPr>
+        <w:ind w:left="6480" w:hanging="180"/>
+      </w:pPr>
+    </w:lvl>
+  </w:abstractNum>
+  <w:abstractNum w:abstractNumId="2" w15:restartNumberingAfterBreak="0">
     <w:nsid w:val="2118467D"/>
     <w:multiLevelType w:val="hybridMultilevel"/>
     <w:tmpl w:val="BE2C479E"/>
@@ -803,7 +1027,7 @@
       </w:rPr>
     </w:lvl>
   </w:abstractNum>
-  <w:abstractNum w:abstractNumId="2" w15:restartNumberingAfterBreak="0">
+  <w:abstractNum w:abstractNumId="3" w15:restartNumberingAfterBreak="0">
     <w:nsid w:val="24022A0E"/>
     <w:multiLevelType w:val="hybridMultilevel"/>
     <w:tmpl w:val="380ED74A"/>
@@ -892,7 +1116,7 @@
       </w:pPr>
     </w:lvl>
   </w:abstractNum>
-  <w:abstractNum w:abstractNumId="3" w15:restartNumberingAfterBreak="0">
+  <w:abstractNum w:abstractNumId="4" w15:restartNumberingAfterBreak="0">
     <w:nsid w:val="5CE7554C"/>
     <w:multiLevelType w:val="multilevel"/>
     <w:tmpl w:val="FE3C04A2"/>
@@ -1041,7 +1265,7 @@
       </w:rPr>
     </w:lvl>
   </w:abstractNum>
-  <w:abstractNum w:abstractNumId="4" w15:restartNumberingAfterBreak="0">
+  <w:abstractNum w:abstractNumId="5" w15:restartNumberingAfterBreak="0">
     <w:nsid w:val="6E9A6B2E"/>
     <w:multiLevelType w:val="hybridMultilevel"/>
     <w:tmpl w:val="95C2C48A"/>
@@ -1131,19 +1355,22 @@
     </w:lvl>
   </w:abstractNum>
   <w:num w:numId="1" w16cid:durableId="360474591">
-    <w:abstractNumId w:val="2"/>
+    <w:abstractNumId w:val="3"/>
   </w:num>
   <w:num w:numId="2" w16cid:durableId="1957711795">
     <w:abstractNumId w:val="0"/>
   </w:num>
   <w:num w:numId="3" w16cid:durableId="389690798">
-    <w:abstractNumId w:val="3"/>
+    <w:abstractNumId w:val="4"/>
   </w:num>
   <w:num w:numId="4" w16cid:durableId="1538663543">
-    <w:abstractNumId w:val="1"/>
+    <w:abstractNumId w:val="2"/>
   </w:num>
   <w:num w:numId="5" w16cid:durableId="1492453231">
-    <w:abstractNumId w:val="4"/>
+    <w:abstractNumId w:val="5"/>
+  </w:num>
+  <w:num w:numId="6" w16cid:durableId="1069423836">
+    <w:abstractNumId w:val="1"/>
   </w:num>
 </w:numbering>
 </file>

</xml_diff>

<commit_message>
Day #379 - I now know how to figure out the SHA256 algorithm
</commit_message>
<xml_diff>
--- a/src/coursera/meta_front_end_developer/course_principles_of_ux_ui_design/final_assessment/BOOKING_A_TABLE_ON_LITTLE_LEMON_WEBSITE_NOTES.docx
+++ b/src/coursera/meta_front_end_developer/course_principles_of_ux_ui_design/final_assessment/BOOKING_A_TABLE_ON_LITTLE_LEMON_WEBSITE_NOTES.docx
@@ -525,25 +525,110 @@
     </w:p>
     <w:p/>
     <w:p>
+      <w:r>
+        <w:lastRenderedPageBreak/>
+        <w:drawing>
+          <wp:inline distT="0" distB="0" distL="0" distR="0" wp14:anchorId="2AE93AC2" wp14:editId="2E7C6CA9">
+            <wp:extent cx="5943600" cy="4860290"/>
+            <wp:effectExtent l="0" t="0" r="0" b="0"/>
+            <wp:docPr id="245052172" name="Picture 1"/>
+            <wp:cNvGraphicFramePr>
+              <a:graphicFrameLocks xmlns:a="http://schemas.openxmlformats.org/drawingml/2006/main" noChangeAspect="1"/>
+            </wp:cNvGraphicFramePr>
+            <a:graphic xmlns:a="http://schemas.openxmlformats.org/drawingml/2006/main">
+              <a:graphicData uri="http://schemas.openxmlformats.org/drawingml/2006/picture">
+                <pic:pic xmlns:pic="http://schemas.openxmlformats.org/drawingml/2006/picture">
+                  <pic:nvPicPr>
+                    <pic:cNvPr id="245052172" name=""/>
+                    <pic:cNvPicPr/>
+                  </pic:nvPicPr>
+                  <pic:blipFill>
+                    <a:blip r:embed="rId9"/>
+                    <a:stretch>
+                      <a:fillRect/>
+                    </a:stretch>
+                  </pic:blipFill>
+                  <pic:spPr>
+                    <a:xfrm>
+                      <a:off x="0" y="0"/>
+                      <a:ext cx="5943600" cy="4860290"/>
+                    </a:xfrm>
+                    <a:prstGeom prst="rect">
+                      <a:avLst/>
+                    </a:prstGeom>
+                  </pic:spPr>
+                </pic:pic>
+              </a:graphicData>
+            </a:graphic>
+          </wp:inline>
+        </w:drawing>
+      </w:r>
+    </w:p>
+    <w:p>
       <w:pPr>
         <w:pStyle w:val="Heading1"/>
       </w:pPr>
       <w:r>
+        <w:lastRenderedPageBreak/>
         <w:t>Wireframes</w:t>
       </w:r>
     </w:p>
+    <w:p>
+      <w:r>
+        <w:drawing>
+          <wp:inline distT="0" distB="0" distL="0" distR="0" wp14:anchorId="34263714" wp14:editId="2400A8BC">
+            <wp:extent cx="5943600" cy="4359910"/>
+            <wp:effectExtent l="0" t="0" r="0" b="2540"/>
+            <wp:docPr id="1198702563" name="Picture 1" descr="A screenshot of a computer&#10;&#10;AI-generated content may be incorrect."/>
+            <wp:cNvGraphicFramePr>
+              <a:graphicFrameLocks xmlns:a="http://schemas.openxmlformats.org/drawingml/2006/main" noChangeAspect="1"/>
+            </wp:cNvGraphicFramePr>
+            <a:graphic xmlns:a="http://schemas.openxmlformats.org/drawingml/2006/main">
+              <a:graphicData uri="http://schemas.openxmlformats.org/drawingml/2006/picture">
+                <pic:pic xmlns:pic="http://schemas.openxmlformats.org/drawingml/2006/picture">
+                  <pic:nvPicPr>
+                    <pic:cNvPr id="1198702563" name="Picture 1" descr="A screenshot of a computer&#10;&#10;AI-generated content may be incorrect."/>
+                    <pic:cNvPicPr/>
+                  </pic:nvPicPr>
+                  <pic:blipFill>
+                    <a:blip r:embed="rId10"/>
+                    <a:stretch>
+                      <a:fillRect/>
+                    </a:stretch>
+                  </pic:blipFill>
+                  <pic:spPr>
+                    <a:xfrm>
+                      <a:off x="0" y="0"/>
+                      <a:ext cx="5943600" cy="4359910"/>
+                    </a:xfrm>
+                    <a:prstGeom prst="rect">
+                      <a:avLst/>
+                    </a:prstGeom>
+                  </pic:spPr>
+                </pic:pic>
+              </a:graphicData>
+            </a:graphic>
+          </wp:inline>
+        </w:drawing>
+      </w:r>
+    </w:p>
+    <w:p>
+      <w:r>
+        <w:t>After the customer enters their e-mail address we check if there is a table reservation associated with the address and display the current details and change the “Create Table Reservation” to two buttons “Cancel Reservation” and “Update Reservation”.  We only prototype the scenario of creating a table reservation.</w:t>
+      </w:r>
+    </w:p>
+    <w:p>
+      <w:pPr>
+        <w:pStyle w:val="Heading1"/>
+      </w:pPr>
+      <w:r>
+        <w:t>Prototype</w:t>
+      </w:r>
+    </w:p>
     <w:p/>
-    <w:p>
-      <w:pPr>
-        <w:pStyle w:val="Heading1"/>
-      </w:pPr>
-      <w:r>
-        <w:t>Prototype</w:t>
-      </w:r>
-    </w:p>
     <w:sectPr>
-      <w:headerReference w:type="default" r:id="rId9"/>
-      <w:footerReference w:type="default" r:id="rId10"/>
+      <w:headerReference w:type="default" r:id="rId11"/>
+      <w:footerReference w:type="default" r:id="rId12"/>
       <w:pgSz w:w="12240" w:h="15840"/>
       <w:pgMar w:top="1440" w:right="1440" w:bottom="1440" w:left="1440" w:header="720" w:footer="720" w:gutter="0"/>
       <w:cols w:space="720"/>

</xml_diff>